<commit_message>
Release AI Career Copilot v1.0
Completed AI Career Copilot v1.0 with live job search, AI-powered resume generation, and job matching.

Key features:
- Career profile management
- AI resume generation using OpenRouter
- Live Adzuna and Reed job integration
- AI match score calculation
- Mobile-friendly job dashboard
- One-click tailored resume generation
- Word (.docx) resume export
- FastAPI, SQLAlchemy and SQLite backend
- General code cleanup and project structure improvements

This release represents the first stable version of the AI Career Copilot portfolio project.
</commit_message>
<xml_diff>
--- a/storage/tailored_resume.docx
+++ b/storage/tailored_resume.docx
@@ -12,22 +12,17 @@
     </w:p>
     <w:p>
       <w:r>
-        <w:t>Senior AI Solutions Architect | Telecom AI Specialist | DWDM | IP/MPLS | Azure OpenAI | RAG</w:t>
+        <w:t>Senior AI Solutions Architect | Telecom AI &amp; Network Automation Specialist</w:t>
       </w:r>
     </w:p>
     <w:p>
       <w:r>
-        <w:t>United Kingdom (UK ILR holder – available for UK remote/contract roles)</w:t>
+        <w:t>United Kingdom | +92 333 528 9080 | salman_181@hotmail.com</w:t>
       </w:r>
     </w:p>
     <w:p>
       <w:r>
-        <w:t>LinkedIn: https://linkedin.com/in/salmanshahid | GitHub: https://github.com/salman-telecomAI</w:t>
-      </w:r>
-    </w:p>
-    <w:p>
-      <w:r>
-        <w:t>Phone: +92 333 528 9080 | Email: salman_181@hotmail.com</w:t>
+        <w:t>LinkedIn: linkedin.com/in/salmanshahid | GitHub: github.com/salman-telecomAI</w:t>
       </w:r>
     </w:p>
     <w:p/>
@@ -39,9 +34,10 @@
         <w:t>PROFESSIONAL SUMMARY</w:t>
       </w:r>
     </w:p>
+    <w:p/>
     <w:p>
       <w:r>
-        <w:t>High-impact Senior AI Solutions Architect with deep domain expertise in Telecom infrastructure, specializing in the intersection of AI-powered automation and Optical Transport networks. Expert in designing and deploying production-ready AI solutions, including Retrieval-Augmented Generation (RAG) systems using Azure OpenAI, FastAPI, and Docker to drive intelligent network operations. Extensive background in large-scale telecom environments (Virgin Media, BT, Ciena) with specialized knowledge in DWDM, OTN, IP/MPLS, and core routing across Huawei, Ciena, Ericsson, and Nokia platforms. Proven track record in transitioning complex telecom NOC operations into automated, AI-driven environments. PMP and ITIL certified, focused on delivering resilient, intelligent, and automated network architectures through modern Cloud and AI technologies.</w:t>
+        <w:t>High-impact Senior AI Solutions Architect with a unique fusion of deep Telecom domain expertise and advanced Applied AI engineering. Specialist in designing AI-powered automation solutions for complex telecommunications infrastructures, including DWDM, Optical Networks (OTN), and IP/MPLS. Proven track record of developing production-ready AI architectures using Azure OpenAI, Python, FastAPI, RAG, and Docker to drive intelligent network operations (AIOps). Extensive experience delivering large-scale network transformation projects for major UK operators including Virgin Media and BT, working with industry-leading vendors such as Huawei, Ciena, Ericsson, and Nokia. Expert at bridging the gap between traditional transport network engineering and modern LLM-driven automation to solve critical telecom operational challenges. UK ILR holder, available for UK-based remote or contract engagements.</w:t>
       </w:r>
     </w:p>
     <w:p/>
@@ -53,53 +49,25 @@
         <w:t>CORE COMPETENCIES</w:t>
       </w:r>
     </w:p>
+    <w:p/>
     <w:p>
       <w:r>
-        <w:t>AI &amp; Automation: Azure OpenAI, Retrieval-Augmented Generation (RAG), Python, FastAPI, ChromaDB Vector Search, Docker, Azure AI Foundry, Network Automation, AIOps.</w:t>
+        <w:t>AI &amp; Automation: AI Solutions Architecture, Azure OpenAI, Retrieval-Augmented Generation (RAG), LLM Integration, AIOps, Network Automation, Python, FastAPI, ChromaDB Vector Search, Docker, Azure AI Foundry.</w:t>
       </w:r>
     </w:p>
     <w:p>
       <w:r>
-        <w:t>Telecom Domain: DWDM, Optical Transport, OTN, SDH, IP/MPLS, Core Routing, BGP, MPLS-VPN, Huawei CX600, Ultra-Long-Haul Optical.</w:t>
+        <w:t>Telecom Infrastructure: DWDM, OTN, Optical Networks, SDH, IP/MPLS, Core Routing (Huawei CX600), Backhaul, Ultra-Long-Haul Optical, SONET.</w:t>
       </w:r>
     </w:p>
     <w:p>
       <w:r>
-        <w:t>Network Operations: NOC Management, Major Incident Management, SLA Management, Service Delivery, Troubleshooting, Network Transformation.</w:t>
+        <w:t>Operations &amp; Governance: NOC Management, Major Incident Management (MIM), Service Level Agreement (SLA) Adherence, ITIL v3, Project Management (PMP), Risk Management, Stakeholder Engagement.</w:t>
       </w:r>
     </w:p>
     <w:p>
       <w:r>
-        <w:t>Leadership &amp; Governance: Solution Architecture, Project Management (PMP), PMO Leadership, Stakeholder Engagement, Risk Management, Technical Audits.</w:t>
-      </w:r>
-    </w:p>
-    <w:p>
-      <w:r>
-        <w:t>Vendor Expertise: Huawei, Ciena, Ericsson, Nokia, ZTE.</w:t>
-      </w:r>
-    </w:p>
-    <w:p/>
-    <w:p>
-      <w:pPr>
-        <w:pStyle w:val="Heading1"/>
-      </w:pPr>
-      <w:r>
-        <w:t>TECHNICAL SKILLS</w:t>
-      </w:r>
-    </w:p>
-    <w:p>
-      <w:r>
-        <w:t>AI/ML: Azure OpenAI, RAG, Python, FastAPI, Docker, ChromaDB, Vector Databases, Azure AI Foundry.</w:t>
-      </w:r>
-    </w:p>
-    <w:p>
-      <w:r>
-        <w:t>Networking: DWDM, OTN, SDH, SONET, IP/MPLS, BGP, Core &amp; Aggregation Networks, Huawei CX600, Ciena, Ericsson, Nokia, ZTE.</w:t>
-      </w:r>
-    </w:p>
-    <w:p>
-      <w:r>
-        <w:t>Cloud &amp; Tools: AWS, Azure, NMS Tools, ITIL v3 Framework.</w:t>
+        <w:t>Vendor Ecosystems: Huawei, Ciena, Ericsson, Nokia, ZTE.</w:t>
       </w:r>
     </w:p>
     <w:p/>
@@ -114,176 +82,165 @@
     <w:p/>
     <w:p>
       <w:r>
-        <w:t>Director / Principal Consultant | Lightmile Consulting Ltd (UK) | Jan 2021 – Present</w:t>
-      </w:r>
-    </w:p>
-    <w:p>
-      <w:r>
-        <w:t>Independent IT &amp; Telecom consultancy — UK registered, operating remotely.</w:t>
-      </w:r>
-    </w:p>
-    <w:p>
-      <w:r>
-        <w:t>- Designed and architected a production-ready Telecom AI NOC RAG Assistant (Azure OpenAI, FastAPI, ChromaDB, Docker) delivering Retrieval-Augmented Generation for intelligent network troubleshooting and operational knowledge management.</w:t>
-      </w:r>
-    </w:p>
-    <w:p>
-      <w:r>
-        <w:t>- Applying Applied AI and Azure AI Foundry skills to telecom NOC use cases, bridging deep DWDM/OTN/IP-MPLS domain expertise with modern LLM and RAG-based automation for network operations.</w:t>
-      </w:r>
-    </w:p>
-    <w:p>
-      <w:r>
-        <w:t>- Deliver specialist consultancy on SDH/DWDM transmission, IP/MPLS core routing, and NOC operational frameworks for UK and international telecom clients.</w:t>
-      </w:r>
-    </w:p>
-    <w:p>
-      <w:r>
-        <w:t>- Lead Huawei CX600 core router integration, configuration validation, troubleshooting, and operational handover activities.</w:t>
-      </w:r>
-    </w:p>
-    <w:p>
-      <w:r>
-        <w:t>- Provide project governance, technical audits, documentation, and stakeholder engagement for network transformation programmes.</w:t>
-      </w:r>
-    </w:p>
-    <w:p>
-      <w:r>
-        <w:t>- Manage service optimisation initiatives, driving improvements in network reliability and SLA adherence.</w:t>
+        <w:t>Lightmile Consulting Ltd (UK) | Director / Principal Consultant | Jan 2021 – Present</w:t>
       </w:r>
     </w:p>
     <w:p/>
     <w:p>
       <w:r>
-        <w:t>Operational Consultant | ITEL Solutions | Aug 2019 – Dec 2021</w:t>
+        <w:t>Architected and developed a production-ready Telecom AI NOC RAG Assistant using Azure OpenAI, FastAPI, ChromaDB, and Docker, implementing Retrieval-Augmented Generation for intelligent network troubleshooting and automated operational knowledge management.</w:t>
       </w:r>
     </w:p>
     <w:p>
       <w:r>
-        <w:t>- Provided IP/MPLS core and transmission NOC operational support, covering L2/L3 incident management and cross-vendor escalations.</w:t>
+        <w:t>Design AI-driven automation solutions and applied AI workflows to bridge deep DWDM/OTN/IP-MPLS domain expertise with modern LLM technologies for telecom NOC use cases.</w:t>
       </w:r>
     </w:p>
     <w:p>
       <w:r>
-        <w:t>- Owned major incident management lifecycle — from detection through resolution — ensuring minimal MTTR and SLA compliance.</w:t>
+        <w:t>Deliver specialist consultancy on SDH/DWDM transmission, IP/MPLS core routing, and NOC operational frameworks for UK and international telecom clients.</w:t>
       </w:r>
     </w:p>
     <w:p>
       <w:r>
-        <w:t>- Developed and maintained operational runbooks, KPI dashboards, and change management documentation.</w:t>
+        <w:t>Lead Huawei CX600 core router integration, configuration validation, and technical troubleshooting to ensure high-availability network performance.</w:t>
+      </w:r>
+    </w:p>
+    <w:p>
+      <w:r>
+        <w:t>Provide project governance, technical audits, and stakeholder engagement for large-scale network transformation programmes.</w:t>
+      </w:r>
+    </w:p>
+    <w:p>
+      <w:r>
+        <w:t>Manage service optimisation initiatives to drive network reliability and strict SLA adherence.</w:t>
       </w:r>
     </w:p>
     <w:p/>
     <w:p>
       <w:r>
-        <w:t>Project Manager | Ciena (UK) | Aug 2019 – Jul 2020</w:t>
-      </w:r>
-    </w:p>
-    <w:p>
-      <w:r>
-        <w:t>- Managed DWDM transmission backhaul and core integration rollout projects for Virgin Media and BT across multiple UK regions.</w:t>
-      </w:r>
-    </w:p>
-    <w:p>
-      <w:r>
-        <w:t>- Led PMO activities including schedule management, risk registers, dependency tracking, and executive delivery reporting throughout the COVID-19 lockdown period.</w:t>
-      </w:r>
-    </w:p>
-    <w:p>
-      <w:r>
-        <w:t>- Coordinated site readiness, third-party contractors, and cross-functional teams to deliver on time within constrained field access conditions.</w:t>
+        <w:t>ITEL Solutions | Operational Consultant | Aug 2019 – Dec 2021</w:t>
       </w:r>
     </w:p>
     <w:p/>
     <w:p>
       <w:r>
-        <w:t>Senior Project Consultant | Ericsson (UK) | May 2018 – Jul 2018</w:t>
+        <w:t>Provided IP/MPLS core and transmission NOC operational support, managing L2/L3 incident management and cross-vendor escalations.</w:t>
       </w:r>
     </w:p>
     <w:p>
       <w:r>
-        <w:t>- Supported DWDM transmission rollout and deployment coordination across aggregation and core network layers.</w:t>
+        <w:t>Owned the major incident management lifecycle to ensure minimal Mean Time to Repair (MTTR) and full SLA compliance.</w:t>
       </w:r>
     </w:p>
     <w:p>
       <w:r>
-        <w:t>- Validated core network readiness pre-service launch; maintained delivery tracking and stakeholder reporting.</w:t>
+        <w:t>Developed operational runbooks, KPI dashboards, and change management documentation for complex network environments.</w:t>
       </w:r>
     </w:p>
     <w:p/>
     <w:p>
       <w:r>
-        <w:t>Consultant – NOC Operations | Virgin Media (UK) | Jan 2017 – Mar 2018</w:t>
-      </w:r>
-    </w:p>
-    <w:p>
-      <w:r>
-        <w:t>- Provided 24x7 NOC support for Virgin Media's core IP/MPLS and SDH/DWDM transmission networks.</w:t>
-      </w:r>
-    </w:p>
-    <w:p>
-      <w:r>
-        <w:t>- Managed Huawei and multi-vendor core routing incidents, escalations, and emergency change approvals.</w:t>
-      </w:r>
-    </w:p>
-    <w:p>
-      <w:r>
-        <w:t>- Performed KPI monitoring, performance reporting, and network documentation management in high-availability environments.</w:t>
+        <w:t>Ciena (UK) | Project Manager | Aug 2019 – Jul 2020</w:t>
       </w:r>
     </w:p>
     <w:p/>
     <w:p>
       <w:r>
-        <w:t>Consultant – Project Delivery | Ericsson | Sep 2014 – Sep 2016</w:t>
+        <w:t>Managed DWDM transmission backhaul and core integration rollout projects for major UK operators Virgin Media and BT.</w:t>
       </w:r>
     </w:p>
     <w:p>
       <w:r>
-        <w:t>- Delivered core transmission integration, DWDM ultra-long-haul network expansion, and large-scale upgrade projects.</w:t>
+        <w:t>Led PMO activities including schedule management, risk registers, and dependency tracking during the COVID-19 lockdown to ensure project continuity.</w:t>
       </w:r>
     </w:p>
     <w:p>
       <w:r>
-        <w:t>- Provided field, NMS, and escalation support across SDH/DWDM transmission domains; led optical testing, commissioning, and acceptance activities.</w:t>
+        <w:t>Coordinated site readiness, third-party contractors, and cross-functional teams to deliver high-priority infrastructure projects on schedule.</w:t>
+      </w:r>
+    </w:p>
+    <w:p/>
+    <w:p>
+      <w:r>
+        <w:t>Ericsson (UK) | Senior Project Consultant | May 2018 – Jul 2018</w:t>
+      </w:r>
+    </w:p>
+    <w:p/>
+    <w:p>
+      <w:r>
+        <w:t>Supported DWDM transmission rollout and deployment coordination across aggregation and core network layers.</w:t>
       </w:r>
     </w:p>
     <w:p>
       <w:r>
-        <w:t>- Supported migration and stabilisation of legacy transmission networks during upgrade cycles.</w:t>
+        <w:t>Validated core network readiness pre-service launch and maintained rigorous delivery tracking and stakeholder reporting.</w:t>
       </w:r>
     </w:p>
     <w:p/>
     <w:p>
-      <w:pPr>
-        <w:pStyle w:val="Heading1"/>
-      </w:pPr>
       <w:r>
-        <w:t>EARLIER CAREER (2001 – 2013)</w:t>
+        <w:t>Virgin Media (UK) | Consultant – NOC Operations | Jan 2017 – Mar 2018</w:t>
+      </w:r>
+    </w:p>
+    <w:p/>
+    <w:p>
+      <w:r>
+        <w:t>Provided 24x7 NOC support for core IP/MPLS and SDH/DWDM transmission networks.</w:t>
       </w:r>
     </w:p>
     <w:p>
       <w:r>
-        <w:t>Ericsson | Nortel | Huawei</w:t>
+        <w:t>Managed Huawei and multi-vendor core routing incidents, escalations, and emergency change approvals in a high-availability environment.</w:t>
       </w:r>
     </w:p>
     <w:p>
       <w:r>
-        <w:t>- Core Routing, SDH/DWDM Transmission, NOC &amp; Network Operations.</w:t>
+        <w:t>Performed KPI monitoring and performance reporting to ensure network stability.</w:t>
+      </w:r>
+    </w:p>
+    <w:p/>
+    <w:p>
+      <w:r>
+        <w:t>Ericsson | Consultant – Project Delivery | Sep 2014 – Sep 2016</w:t>
+      </w:r>
+    </w:p>
+    <w:p/>
+    <w:p>
+      <w:r>
+        <w:t>Delivered core transmission integration and DWDM ultra-long-haul network expansion projects.</w:t>
       </w:r>
     </w:p>
     <w:p>
       <w:r>
-        <w:t>- Progressed from hands-on transmission engineering to senior delivery and operations roles.</w:t>
+        <w:t>Provided field, NMS, and escalation support across SDH/DWDM transmission domains, including optical testing, commissioning, and acceptance activities.</w:t>
       </w:r>
     </w:p>
     <w:p>
       <w:r>
-        <w:t>- Led global rollout projects, NOC setup and governance, network migrations, and multi-vendor integration programmes.</w:t>
+        <w:t>Supported the migration and stabilisation of legacy transmission networks during large-scale upgrade cycles.</w:t>
+      </w:r>
+    </w:p>
+    <w:p/>
+    <w:p>
+      <w:r>
+        <w:t>Ericsson / Nortel / Huawei | Core Routing, SDH/DWDM Transmission, NOC &amp; Network Operations | 2001 – 2013</w:t>
+      </w:r>
+    </w:p>
+    <w:p/>
+    <w:p>
+      <w:r>
+        <w:t>Over 12 years of progressive experience in transmission engineering and senior delivery roles.</w:t>
       </w:r>
     </w:p>
     <w:p>
       <w:r>
-        <w:t>- Developed deep expertise in Huawei CX-series routers, SDH/DWDM optical platforms, network commissioning, and acceptance testing.</w:t>
+        <w:t>Led global rollout projects, NOC setup and governance, and multi-vendor network migrations.</w:t>
+      </w:r>
+    </w:p>
+    <w:p>
+      <w:r>
+        <w:t>Deep expertise in Huawei CX-series routers and SDH/DWDM optical platforms.</w:t>
       </w:r>
     </w:p>
     <w:p/>
@@ -295,9 +252,51 @@
         <w:t>KEY PROJECTS</w:t>
       </w:r>
     </w:p>
+    <w:p/>
     <w:p>
       <w:r>
-        <w:t>Telecom AI NOC RAG Assistant: Developed a production-grade AI solution using Azure OpenAI, FastAPI, and ChromaDB to enable intelligent, automated network troubleshooting via Retrieval-Augmented Generation.</w:t>
+        <w:t>Telecom AI NOC RAG Assistant: An end-to-end production-grade reference implementation (GitHub) using Azure OpenAI, FastAPI, ChromaDB, and Docker. Designed to automate intelligent network troubleshooting via Retrieval-Augmented Generation (RAG) for telecom operational knowledge management.</w:t>
+      </w:r>
+    </w:p>
+    <w:p/>
+    <w:p>
+      <w:r>
+        <w:t>DWDM Backhaul Rollout (BT/Virgin Media): Managed the core integration and rollout of DWDM transmission infrastructure across multiple UK regions via Ciena.</w:t>
+      </w:r>
+    </w:p>
+    <w:p/>
+    <w:p>
+      <w:pPr>
+        <w:pStyle w:val="Heading1"/>
+      </w:pPr>
+      <w:r>
+        <w:t>CORE TELECOM &amp; AI SKILLS</w:t>
+      </w:r>
+    </w:p>
+    <w:p/>
+    <w:p>
+      <w:r>
+        <w:t>AI Frameworks: Azure OpenAI, RAG, LLM Orchestration, Azure AI Foundry.</w:t>
+      </w:r>
+    </w:p>
+    <w:p>
+      <w:r>
+        <w:t>Programming &amp; DevOps: Python, FastAPI, Docker, Vector Databases (ChromaDB).</w:t>
+      </w:r>
+    </w:p>
+    <w:p>
+      <w:r>
+        <w:t>Network Protocols: IP/MPLS, BGP, MPLS-VPN, SDH, SONET.</w:t>
+      </w:r>
+    </w:p>
+    <w:p>
+      <w:r>
+        <w:t>Transport Technologies: DWDM, OTN, Optical Transmission, Ultra-Long-Haul.</w:t>
+      </w:r>
+    </w:p>
+    <w:p>
+      <w:r>
+        <w:t>Hardware/Vendors: Huawei (CX600), Ciena, Ericsson, Nokia, ZTE.</w:t>
       </w:r>
     </w:p>
     <w:p/>
@@ -309,6 +308,7 @@
         <w:t>CERTIFICATIONS</w:t>
       </w:r>
     </w:p>
+    <w:p/>
     <w:p>
       <w:r>
         <w:t>PMP — Project Management Professional (PMI)</w:t>
@@ -321,7 +321,7 @@
     </w:p>
     <w:p>
       <w:r>
-        <w:t>AWS Certified</w:t>
+        <w:t>AWS Certified (Cloud Practitioner)</w:t>
       </w:r>
     </w:p>
     <w:p>
@@ -335,27 +335,18 @@
         <w:pStyle w:val="Heading1"/>
       </w:pPr>
       <w:r>
-        <w:t>NOTABLE UK CLIENT ENGAGEMENTS</w:t>
+        <w:t>ADDITIONAL INFORMATION</w:t>
+      </w:r>
+    </w:p>
+    <w:p/>
+    <w:p>
+      <w:r>
+        <w:t>Portfolio: github.com/salman-telecomAI/telecom-ai-noc-rag-assistant</w:t>
       </w:r>
     </w:p>
     <w:p>
       <w:r>
-        <w:t>Virgin Media — 24x7 NOC core &amp; transmission support; multi-vendor incident management</w:t>
-      </w:r>
-    </w:p>
-    <w:p>
-      <w:r>
-        <w:t>BT — DWDM backhaul rollout coordination (via Ciena)</w:t>
-      </w:r>
-    </w:p>
-    <w:p>
-      <w:r>
-        <w:t>Ciena UK — DWDM transmission project management across UK regions</w:t>
-      </w:r>
-    </w:p>
-    <w:p>
-      <w:r>
-        <w:t>Ericsson UK — DWDM deployment support and core network validation</w:t>
+        <w:t>Status: UK ILR Holder (Full right to work in the UK)</w:t>
       </w:r>
     </w:p>
     <w:sectPr>

</xml_diff>